<commit_message>
feat(creatoros): add technology partner credit and drop legacy ToolPilotPro branding
Footer now credits Ridhyansh Tech Infra Private Limited and reads CreatorOS; scrub ToolPilotPro from package description, architecture doc, and schema header.
</commit_message>
<xml_diff>
--- a/creatoros/docs/MARKETING-PLAN.docx
+++ b/creatoros/docs/MARKETING-PLAN.docx
@@ -164,6 +164,42 @@
     </w:p>
     <w:p>
       <w:pPr>
+        <w:pStyle w:val="NormalWeb"/>
+        <w:rPr>
+          <w:rFonts w:ascii="Calibri" w:hAnsi="Calibri" w:cs="Calibri"/>
+          <w:sz w:val="22"/>
+          <w:szCs w:val="22"/>
+        </w:rPr>
+      </w:pPr>
+      <w:r>
+        <w:rPr>
+          <w:rStyle w:val="Strong"/>
+          <w:rFonts w:ascii="Calibri" w:hAnsi="Calibri" w:cs="Calibri"/>
+          <w:sz w:val="22"/>
+          <w:szCs w:val="22"/>
+        </w:rPr>
+        <w:t xml:space="preserve">Technology </w:t>
+      </w:r>
+      <w:r>
+        <w:rPr>
+          <w:rStyle w:val="Strong"/>
+          <w:rFonts w:ascii="Calibri" w:hAnsi="Calibri" w:cs="Calibri"/>
+          <w:sz w:val="22"/>
+          <w:szCs w:val="22"/>
+        </w:rPr>
+        <w:t>partner:</w:t>
+      </w:r>
+      <w:r>
+        <w:rPr>
+          <w:rFonts w:ascii="Calibri" w:hAnsi="Calibri" w:cs="Calibri"/>
+          <w:sz w:val="22"/>
+          <w:szCs w:val="22"/>
+        </w:rPr>
+        <w:t xml:space="preserve"> Ridhyansh Tech Infra Private Limited.</w:t>
+      </w:r>
+    </w:p>
+    <w:p>
+      <w:pPr>
         <w:pStyle w:val="Heading2"/>
         <w:rPr>
           <w:rFonts w:ascii="Calibri" w:eastAsia="Times New Roman" w:hAnsi="Calibri" w:cs="Calibri"/>
@@ -173,13 +209,7 @@
         <w:rPr>
           <w:rFonts w:ascii="Calibri" w:eastAsia="Times New Roman" w:hAnsi="Calibri" w:cs="Calibri"/>
         </w:rPr>
-        <w:t>1. Position</w:t>
-      </w:r>
-      <w:r>
-        <w:rPr>
-          <w:rFonts w:ascii="Calibri" w:eastAsia="Times New Roman" w:hAnsi="Calibri" w:cs="Calibri"/>
-        </w:rPr>
-        <w:t>ing</w:t>
+        <w:t>1. Positioning</w:t>
       </w:r>
     </w:p>
     <w:p>
@@ -270,33 +300,33 @@
           <w:sz w:val="22"/>
           <w:szCs w:val="22"/>
         </w:rPr>
-        <w:t>1. One tool replaces 3–4 subscriptions (link page + store + email + bookings).</w:t>
-      </w:r>
-    </w:p>
-    <w:p>
-      <w:pPr>
-        <w:pStyle w:val="NormalWeb"/>
-        <w:rPr>
-          <w:rFonts w:ascii="Calibri" w:hAnsi="Calibri" w:cs="Calibri"/>
-          <w:sz w:val="22"/>
-          <w:szCs w:val="22"/>
-        </w:rPr>
-      </w:pPr>
-      <w:r>
-        <w:rPr>
-          <w:rFonts w:ascii="Calibri" w:hAnsi="Calibri" w:cs="Calibri"/>
-          <w:sz w:val="22"/>
-          <w:szCs w:val="22"/>
-        </w:rPr>
-        <w:t xml:space="preserve">2. Sell from </w:t>
-      </w:r>
-      <w:r>
-        <w:rPr>
-          <w:rFonts w:ascii="Calibri" w:hAnsi="Calibri" w:cs="Calibri"/>
-          <w:sz w:val="22"/>
-          <w:szCs w:val="22"/>
-        </w:rPr>
-        <w:t>day one (products, courses, paid bookings, receipts).</w:t>
+        <w:t>1. One tool replaces 3–4 subscript</w:t>
+      </w:r>
+      <w:r>
+        <w:rPr>
+          <w:rFonts w:ascii="Calibri" w:hAnsi="Calibri" w:cs="Calibri"/>
+          <w:sz w:val="22"/>
+          <w:szCs w:val="22"/>
+        </w:rPr>
+        <w:t>ions (link page + store + email + bookings).</w:t>
+      </w:r>
+    </w:p>
+    <w:p>
+      <w:pPr>
+        <w:pStyle w:val="NormalWeb"/>
+        <w:rPr>
+          <w:rFonts w:ascii="Calibri" w:hAnsi="Calibri" w:cs="Calibri"/>
+          <w:sz w:val="22"/>
+          <w:szCs w:val="22"/>
+        </w:rPr>
+      </w:pPr>
+      <w:r>
+        <w:rPr>
+          <w:rFonts w:ascii="Calibri" w:hAnsi="Calibri" w:cs="Calibri"/>
+          <w:sz w:val="22"/>
+          <w:szCs w:val="22"/>
+        </w:rPr>
+        <w:t>2. Sell from day one (products, courses, paid bookings, receipts).</w:t>
       </w:r>
     </w:p>
     <w:p>
@@ -359,33 +389,33 @@
           <w:sz w:val="22"/>
           <w:szCs w:val="22"/>
         </w:rPr>
-        <w:t xml:space="preserve"> free plan limits, $19 vs buying 3 tools (~$40–60/mo),</w:t>
-      </w:r>
-    </w:p>
-    <w:p>
-      <w:pPr>
-        <w:pStyle w:val="NormalWeb"/>
-        <w:rPr>
-          <w:rFonts w:ascii="Calibri" w:hAnsi="Calibri" w:cs="Calibri"/>
-          <w:sz w:val="22"/>
-          <w:szCs w:val="22"/>
-        </w:rPr>
-      </w:pPr>
-      <w:r>
-        <w:rPr>
-          <w:rFonts w:ascii="Calibri" w:hAnsi="Calibri" w:cs="Calibri"/>
-          <w:sz w:val="22"/>
-          <w:szCs w:val="22"/>
-        </w:rPr>
-        <w:t>receipt + analyt</w:t>
-      </w:r>
-      <w:r>
-        <w:rPr>
-          <w:rFonts w:ascii="Calibri" w:hAnsi="Calibri" w:cs="Calibri"/>
-          <w:sz w:val="22"/>
-          <w:szCs w:val="22"/>
-        </w:rPr>
-        <w:t>ics screenshots, creator case snippets as they arrive.</w:t>
+        <w:t xml:space="preserve"> free plan li</w:t>
+      </w:r>
+      <w:r>
+        <w:rPr>
+          <w:rFonts w:ascii="Calibri" w:hAnsi="Calibri" w:cs="Calibri"/>
+          <w:sz w:val="22"/>
+          <w:szCs w:val="22"/>
+        </w:rPr>
+        <w:t>mits, $19 vs buying 3 tools (~$40–60/mo),</w:t>
+      </w:r>
+    </w:p>
+    <w:p>
+      <w:pPr>
+        <w:pStyle w:val="NormalWeb"/>
+        <w:rPr>
+          <w:rFonts w:ascii="Calibri" w:hAnsi="Calibri" w:cs="Calibri"/>
+          <w:sz w:val="22"/>
+          <w:szCs w:val="22"/>
+        </w:rPr>
+      </w:pPr>
+      <w:r>
+        <w:rPr>
+          <w:rFonts w:ascii="Calibri" w:hAnsi="Calibri" w:cs="Calibri"/>
+          <w:sz w:val="22"/>
+          <w:szCs w:val="22"/>
+        </w:rPr>
+        <w:t>receipt + analytics screenshots, creator case snippets as they arrive.</w:t>
       </w:r>
     </w:p>
     <w:p>
@@ -452,7 +482,15 @@
           <w:sz w:val="22"/>
           <w:szCs w:val="22"/>
         </w:rPr>
-        <w:t>digital products, courses, 1:1 calls. Pain: tool sprawl + fees.</w:t>
+        <w:t>digital products, courses, 1:1 c</w:t>
+      </w:r>
+      <w:r>
+        <w:rPr>
+          <w:rFonts w:ascii="Calibri" w:hAnsi="Calibri" w:cs="Calibri"/>
+          <w:sz w:val="22"/>
+          <w:szCs w:val="22"/>
+        </w:rPr>
+        <w:t>alls. Pain: tool sprawl + fees.</w:t>
       </w:r>
     </w:p>
     <w:p>
@@ -479,7 +517,33 @@
           <w:sz w:val="22"/>
           <w:szCs w:val="22"/>
         </w:rPr>
-        <w:t>Freelancers &amp; consultan</w:t>
+        <w:t>Freelancers &amp; consultants:</w:t>
+      </w:r>
+      <w:r>
+        <w:rPr>
+          <w:rFonts w:ascii="Calibri" w:hAnsi="Calibri" w:cs="Calibri"/>
+          <w:sz w:val="22"/>
+          <w:szCs w:val="22"/>
+        </w:rPr>
+        <w:t xml:space="preserve"> bookings + simple store + email list.</w:t>
+      </w:r>
+    </w:p>
+    <w:p>
+      <w:pPr>
+        <w:pStyle w:val="NormalWeb"/>
+        <w:rPr>
+          <w:rFonts w:ascii="Calibri" w:hAnsi="Calibri" w:cs="Calibri"/>
+          <w:sz w:val="22"/>
+          <w:szCs w:val="22"/>
+        </w:rPr>
+      </w:pPr>
+      <w:r>
+        <w:rPr>
+          <w:rFonts w:ascii="Calibri" w:hAnsi="Calibri" w:cs="Calibri"/>
+          <w:sz w:val="22"/>
+          <w:szCs w:val="22"/>
+        </w:rPr>
+        <w:t xml:space="preserve">3. </w:t>
       </w:r>
       <w:r>
         <w:rPr>
@@ -488,15 +552,519 @@
           <w:sz w:val="22"/>
           <w:szCs w:val="22"/>
         </w:rPr>
-        <w:t>ts:</w:t>
-      </w:r>
-      <w:r>
-        <w:rPr>
-          <w:rFonts w:ascii="Calibri" w:hAnsi="Calibri" w:cs="Calibri"/>
-          <w:sz w:val="22"/>
-          <w:szCs w:val="22"/>
-        </w:rPr>
-        <w:t xml:space="preserve"> bookings + simple store + email list.</w:t>
+        <w:t>Small agencies/teams (Business $99):</w:t>
+      </w:r>
+      <w:r>
+        <w:rPr>
+          <w:rFonts w:ascii="Calibri" w:hAnsi="Calibri" w:cs="Calibri"/>
+          <w:sz w:val="22"/>
+          <w:szCs w:val="22"/>
+        </w:rPr>
+        <w:t xml:space="preserve"> white-label, team seats, client pages.</w:t>
+      </w:r>
+    </w:p>
+    <w:p>
+      <w:pPr>
+        <w:pStyle w:val="NormalWeb"/>
+        <w:rPr>
+          <w:rFonts w:ascii="Calibri" w:hAnsi="Calibri" w:cs="Calibri"/>
+          <w:sz w:val="22"/>
+          <w:szCs w:val="22"/>
+        </w:rPr>
+      </w:pPr>
+      <w:r>
+        <w:rPr>
+          <w:rStyle w:val="Strong"/>
+          <w:rFonts w:ascii="Calibri" w:hAnsi="Calibri" w:cs="Calibri"/>
+          <w:sz w:val="22"/>
+          <w:szCs w:val="22"/>
+        </w:rPr>
+        <w:t>Anti-ICP (say no early):</w:t>
+      </w:r>
+      <w:r>
+        <w:rPr>
+          <w:rFonts w:ascii="Calibri" w:hAnsi="Calibri" w:cs="Calibri"/>
+          <w:sz w:val="22"/>
+          <w:szCs w:val="22"/>
+        </w:rPr>
+        <w:t xml:space="preserve"> enterprises needing SSO/SLA, physical-goods sellers</w:t>
+      </w:r>
+    </w:p>
+    <w:p>
+      <w:pPr>
+        <w:pStyle w:val="NormalWeb"/>
+        <w:rPr>
+          <w:rFonts w:ascii="Calibri" w:hAnsi="Calibri" w:cs="Calibri"/>
+          <w:sz w:val="22"/>
+          <w:szCs w:val="22"/>
+        </w:rPr>
+      </w:pPr>
+      <w:r>
+        <w:rPr>
+          <w:rFonts w:ascii="Calibri" w:hAnsi="Calibri" w:cs="Calibri"/>
+          <w:sz w:val="22"/>
+          <w:szCs w:val="22"/>
+        </w:rPr>
+        <w:t>needing shipping, developers wanting API-first headless.</w:t>
+      </w:r>
+    </w:p>
+    <w:p>
+      <w:pPr>
+        <w:pStyle w:val="Heading2"/>
+        <w:rPr>
+          <w:rFonts w:ascii="Calibri" w:eastAsia="Times New Roman" w:hAnsi="Calibri" w:cs="Calibri"/>
+        </w:rPr>
+      </w:pPr>
+      <w:r>
+        <w:rPr>
+          <w:rFonts w:ascii="Calibri" w:eastAsia="Times New Roman" w:hAnsi="Calibri" w:cs="Calibri"/>
+        </w:rPr>
+        <w:t>3. Funnel and conversion path</w:t>
+      </w:r>
+    </w:p>
+    <w:p>
+      <w:pPr>
+        <w:pStyle w:val="NormalWeb"/>
+        <w:rPr>
+          <w:rFonts w:ascii="Calibri" w:hAnsi="Calibri" w:cs="Calibri"/>
+          <w:sz w:val="22"/>
+          <w:szCs w:val="22"/>
+        </w:rPr>
+      </w:pPr>
+      <w:r>
+        <w:rPr>
+          <w:rFonts w:ascii="Calibri" w:hAnsi="Calibri" w:cs="Calibri"/>
+          <w:sz w:val="22"/>
+          <w:szCs w:val="22"/>
+        </w:rPr>
+        <w:t>Landing (</w:t>
+      </w:r>
+      <w:r>
+        <w:rPr>
+          <w:rStyle w:val="HTMLCode"/>
+        </w:rPr>
+        <w:t>/</w:t>
+      </w:r>
+      <w:r>
+        <w:rPr>
+          <w:rFonts w:ascii="Calibri" w:hAnsi="Calibri" w:cs="Calibri"/>
+          <w:sz w:val="22"/>
+          <w:szCs w:val="22"/>
+        </w:rPr>
+        <w:t>) → Pricing (</w:t>
+      </w:r>
+      <w:r>
+        <w:rPr>
+          <w:rStyle w:val="HTMLCode"/>
+        </w:rPr>
+        <w:t>/pricing</w:t>
+      </w:r>
+      <w:r>
+        <w:rPr>
+          <w:rFonts w:ascii="Calibri" w:hAnsi="Calibri" w:cs="Calibri"/>
+          <w:sz w:val="22"/>
+          <w:szCs w:val="22"/>
+        </w:rPr>
+        <w:t>) → Register (free, consent checkbox) →</w:t>
+      </w:r>
+    </w:p>
+    <w:p>
+      <w:pPr>
+        <w:pStyle w:val="NormalWeb"/>
+        <w:rPr>
+          <w:rFonts w:ascii="Calibri" w:hAnsi="Calibri" w:cs="Calibri"/>
+          <w:sz w:val="22"/>
+          <w:szCs w:val="22"/>
+        </w:rPr>
+      </w:pPr>
+      <w:r>
+        <w:rPr>
+          <w:rFonts w:ascii="Calibri" w:hAnsi="Calibri" w:cs="Calibri"/>
+          <w:sz w:val="22"/>
+          <w:szCs w:val="22"/>
+        </w:rPr>
+        <w:t>dashboard onboarding → first win checklist:</w:t>
+      </w:r>
+    </w:p>
+    <w:p>
+      <w:pPr>
+        <w:pStyle w:val="NormalWeb"/>
+        <w:rPr>
+          <w:rFonts w:ascii="Calibri" w:hAnsi="Calibri" w:cs="Calibri"/>
+          <w:sz w:val="22"/>
+          <w:szCs w:val="22"/>
+        </w:rPr>
+      </w:pPr>
+      <w:r>
+        <w:rPr>
+          <w:rFonts w:ascii="Calibri" w:hAnsi="Calibri" w:cs="Calibri"/>
+          <w:sz w:val="22"/>
+          <w:szCs w:val="22"/>
+        </w:rPr>
+        <w:t xml:space="preserve">1. publish bio page, 2. add 3 links, 3. add 1 product </w:t>
+      </w:r>
+      <w:r>
+        <w:rPr>
+          <w:rFonts w:ascii="Calibri" w:hAnsi="Calibri" w:cs="Calibri"/>
+          <w:sz w:val="22"/>
+          <w:szCs w:val="22"/>
+        </w:rPr>
+        <w:t>or service,</w:t>
+      </w:r>
+    </w:p>
+    <w:p>
+      <w:pPr>
+        <w:pStyle w:val="NormalWeb"/>
+        <w:rPr>
+          <w:rFonts w:ascii="Calibri" w:hAnsi="Calibri" w:cs="Calibri"/>
+          <w:sz w:val="22"/>
+          <w:szCs w:val="22"/>
+        </w:rPr>
+      </w:pPr>
+      <w:r>
+        <w:rPr>
+          <w:rFonts w:ascii="Calibri" w:hAnsi="Calibri" w:cs="Calibri"/>
+          <w:sz w:val="22"/>
+          <w:szCs w:val="22"/>
+        </w:rPr>
+        <w:t>4. import/collect 10 contacts, 5. send first email.</w:t>
+      </w:r>
+    </w:p>
+    <w:p>
+      <w:pPr>
+        <w:pStyle w:val="NormalWeb"/>
+        <w:rPr>
+          <w:rFonts w:ascii="Calibri" w:hAnsi="Calibri" w:cs="Calibri"/>
+          <w:sz w:val="22"/>
+          <w:szCs w:val="22"/>
+        </w:rPr>
+      </w:pPr>
+      <w:r>
+        <w:rPr>
+          <w:rFonts w:ascii="Calibri" w:hAnsi="Calibri" w:cs="Calibri"/>
+          <w:sz w:val="22"/>
+          <w:szCs w:val="22"/>
+        </w:rPr>
+        <w:t>Upgrade triggers: hit free limits (1 page / 5 links / 10 contacts / 1k views),</w:t>
+      </w:r>
+    </w:p>
+    <w:p>
+      <w:pPr>
+        <w:pStyle w:val="NormalWeb"/>
+        <w:rPr>
+          <w:rFonts w:ascii="Calibri" w:hAnsi="Calibri" w:cs="Calibri"/>
+          <w:sz w:val="22"/>
+          <w:szCs w:val="22"/>
+        </w:rPr>
+      </w:pPr>
+      <w:r>
+        <w:rPr>
+          <w:rFonts w:ascii="Calibri" w:hAnsi="Calibri" w:cs="Calibri"/>
+          <w:sz w:val="22"/>
+          <w:szCs w:val="22"/>
+        </w:rPr>
+        <w:t>custom domain, email automation, AI credits.</w:t>
+      </w:r>
+    </w:p>
+    <w:p>
+      <w:pPr>
+        <w:pStyle w:val="NormalWeb"/>
+        <w:rPr>
+          <w:rFonts w:ascii="Calibri" w:hAnsi="Calibri" w:cs="Calibri"/>
+          <w:sz w:val="22"/>
+          <w:szCs w:val="22"/>
+        </w:rPr>
+      </w:pPr>
+      <w:r>
+        <w:rPr>
+          <w:rStyle w:val="Strong"/>
+          <w:rFonts w:ascii="Calibri" w:hAnsi="Calibri" w:cs="Calibri"/>
+          <w:sz w:val="22"/>
+          <w:szCs w:val="22"/>
+        </w:rPr>
+        <w:t>North-star metric:</w:t>
+      </w:r>
+      <w:r>
+        <w:rPr>
+          <w:rFonts w:ascii="Calibri" w:hAnsi="Calibri" w:cs="Calibri"/>
+          <w:sz w:val="22"/>
+          <w:szCs w:val="22"/>
+        </w:rPr>
+        <w:t xml:space="preserve"> </w:t>
+      </w:r>
+      <w:r>
+        <w:rPr>
+          <w:rFonts w:ascii="Calibri" w:hAnsi="Calibri" w:cs="Calibri"/>
+          <w:sz w:val="22"/>
+          <w:szCs w:val="22"/>
+        </w:rPr>
+        <w:t>activated free workspaces (bio published + ≥1 product/service).</w:t>
+      </w:r>
+    </w:p>
+    <w:p>
+      <w:pPr>
+        <w:pStyle w:val="NormalWeb"/>
+        <w:rPr>
+          <w:rFonts w:ascii="Calibri" w:hAnsi="Calibri" w:cs="Calibri"/>
+          <w:sz w:val="22"/>
+          <w:szCs w:val="22"/>
+        </w:rPr>
+      </w:pPr>
+      <w:r>
+        <w:rPr>
+          <w:rStyle w:val="Strong"/>
+          <w:rFonts w:ascii="Calibri" w:hAnsi="Calibri" w:cs="Calibri"/>
+          <w:sz w:val="22"/>
+          <w:szCs w:val="22"/>
+        </w:rPr>
+        <w:t>Money metrics:</w:t>
+      </w:r>
+      <w:r>
+        <w:rPr>
+          <w:rFonts w:ascii="Calibri" w:hAnsi="Calibri" w:cs="Calibri"/>
+          <w:sz w:val="22"/>
+          <w:szCs w:val="22"/>
+        </w:rPr>
+        <w:t xml:space="preserve"> free→paid %, ARPU, MRR, churn, CAC payback.</w:t>
+      </w:r>
+    </w:p>
+    <w:p>
+      <w:pPr>
+        <w:pStyle w:val="NormalWeb"/>
+        <w:rPr>
+          <w:rFonts w:ascii="Calibri" w:hAnsi="Calibri" w:cs="Calibri"/>
+          <w:sz w:val="22"/>
+          <w:szCs w:val="22"/>
+        </w:rPr>
+      </w:pPr>
+      <w:r>
+        <w:rPr>
+          <w:rFonts w:ascii="Calibri" w:hAnsi="Calibri" w:cs="Calibri"/>
+          <w:sz w:val="22"/>
+          <w:szCs w:val="22"/>
+        </w:rPr>
+        <w:t>Target guardrails (first 90 days): activation ≥25%, free→Creator ≥3%,</w:t>
+      </w:r>
+    </w:p>
+    <w:p>
+      <w:pPr>
+        <w:pStyle w:val="NormalWeb"/>
+        <w:rPr>
+          <w:rFonts w:ascii="Calibri" w:hAnsi="Calibri" w:cs="Calibri"/>
+          <w:sz w:val="22"/>
+          <w:szCs w:val="22"/>
+        </w:rPr>
+      </w:pPr>
+      <w:r>
+        <w:rPr>
+          <w:rFonts w:ascii="Calibri" w:hAnsi="Calibri" w:cs="Calibri"/>
+          <w:sz w:val="22"/>
+          <w:szCs w:val="22"/>
+        </w:rPr>
+        <w:t>email deliverability ≥98%, site p95 &lt; 2s, refund rate &lt;2%.</w:t>
+      </w:r>
+    </w:p>
+    <w:p>
+      <w:pPr>
+        <w:pStyle w:val="Heading2"/>
+        <w:rPr>
+          <w:rFonts w:ascii="Calibri" w:eastAsia="Times New Roman" w:hAnsi="Calibri" w:cs="Calibri"/>
+        </w:rPr>
+      </w:pPr>
+      <w:r>
+        <w:rPr>
+          <w:rFonts w:ascii="Calibri" w:eastAsia="Times New Roman" w:hAnsi="Calibri" w:cs="Calibri"/>
+        </w:rPr>
+        <w:t>4. C</w:t>
+      </w:r>
+      <w:r>
+        <w:rPr>
+          <w:rFonts w:ascii="Calibri" w:eastAsia="Times New Roman" w:hAnsi="Calibri" w:cs="Calibri"/>
+        </w:rPr>
+        <w:t>hannels (ranked by effort/return for a solo founder)</w:t>
+      </w:r>
+    </w:p>
+    <w:p>
+      <w:pPr>
+        <w:pStyle w:val="NormalWeb"/>
+        <w:rPr>
+          <w:rFonts w:ascii="Calibri" w:hAnsi="Calibri" w:cs="Calibri"/>
+          <w:sz w:val="22"/>
+          <w:szCs w:val="22"/>
+        </w:rPr>
+      </w:pPr>
+      <w:r>
+        <w:rPr>
+          <w:rFonts w:ascii="Calibri" w:hAnsi="Calibri" w:cs="Calibri"/>
+          <w:sz w:val="22"/>
+          <w:szCs w:val="22"/>
+        </w:rPr>
+        <w:t xml:space="preserve">1. </w:t>
+      </w:r>
+      <w:r>
+        <w:rPr>
+          <w:rStyle w:val="Strong"/>
+          <w:rFonts w:ascii="Calibri" w:hAnsi="Calibri" w:cs="Calibri"/>
+          <w:sz w:val="22"/>
+          <w:szCs w:val="22"/>
+        </w:rPr>
+        <w:t>Founder-led short video (highest ROI):</w:t>
+      </w:r>
+      <w:r>
+        <w:rPr>
+          <w:rFonts w:ascii="Calibri" w:hAnsi="Calibri" w:cs="Calibri"/>
+          <w:sz w:val="22"/>
+          <w:szCs w:val="22"/>
+        </w:rPr>
+        <w:t xml:space="preserve"> daily 30–60s builds/tips on</w:t>
+      </w:r>
+    </w:p>
+    <w:p>
+      <w:pPr>
+        <w:pStyle w:val="NormalWeb"/>
+        <w:rPr>
+          <w:rFonts w:ascii="Calibri" w:hAnsi="Calibri" w:cs="Calibri"/>
+          <w:sz w:val="22"/>
+          <w:szCs w:val="22"/>
+        </w:rPr>
+      </w:pPr>
+      <w:r>
+        <w:rPr>
+          <w:rFonts w:ascii="Calibri" w:hAnsi="Calibri" w:cs="Calibri"/>
+          <w:sz w:val="22"/>
+          <w:szCs w:val="22"/>
+        </w:rPr>
+        <w:t>YouTube Shorts, Instagram Reels, TikTok. Format: problem → 20s build in</w:t>
+      </w:r>
+    </w:p>
+    <w:p>
+      <w:pPr>
+        <w:pStyle w:val="NormalWeb"/>
+        <w:rPr>
+          <w:rFonts w:ascii="Calibri" w:hAnsi="Calibri" w:cs="Calibri"/>
+          <w:sz w:val="22"/>
+          <w:szCs w:val="22"/>
+        </w:rPr>
+      </w:pPr>
+      <w:r>
+        <w:rPr>
+          <w:rFonts w:ascii="Calibri" w:hAnsi="Calibri" w:cs="Calibri"/>
+          <w:sz w:val="22"/>
+          <w:szCs w:val="22"/>
+        </w:rPr>
+        <w:t>CreatorOS → result. CTA: free link in bio.</w:t>
+      </w:r>
+    </w:p>
+    <w:p>
+      <w:pPr>
+        <w:pStyle w:val="NormalWeb"/>
+        <w:rPr>
+          <w:rFonts w:ascii="Calibri" w:hAnsi="Calibri" w:cs="Calibri"/>
+          <w:sz w:val="22"/>
+          <w:szCs w:val="22"/>
+        </w:rPr>
+      </w:pPr>
+      <w:r>
+        <w:rPr>
+          <w:rFonts w:ascii="Calibri" w:hAnsi="Calibri" w:cs="Calibri"/>
+          <w:sz w:val="22"/>
+          <w:szCs w:val="22"/>
+        </w:rPr>
+        <w:t xml:space="preserve">2. </w:t>
+      </w:r>
+      <w:r>
+        <w:rPr>
+          <w:rStyle w:val="Strong"/>
+          <w:rFonts w:ascii="Calibri" w:hAnsi="Calibri" w:cs="Calibri"/>
+          <w:sz w:val="22"/>
+          <w:szCs w:val="22"/>
+        </w:rPr>
+        <w:t>SEO content (co</w:t>
+      </w:r>
+      <w:r>
+        <w:rPr>
+          <w:rStyle w:val="Strong"/>
+          <w:rFonts w:ascii="Calibri" w:hAnsi="Calibri" w:cs="Calibri"/>
+          <w:sz w:val="22"/>
+          <w:szCs w:val="22"/>
+        </w:rPr>
+        <w:t>mpounds):</w:t>
+      </w:r>
+      <w:r>
+        <w:rPr>
+          <w:rFonts w:ascii="Calibri" w:hAnsi="Calibri" w:cs="Calibri"/>
+          <w:sz w:val="22"/>
+          <w:szCs w:val="22"/>
+        </w:rPr>
+        <w:t xml:space="preserve"> comparison + how-to posts</w:t>
+      </w:r>
+    </w:p>
+    <w:p>
+      <w:pPr>
+        <w:pStyle w:val="NormalWeb"/>
+        <w:rPr>
+          <w:rFonts w:ascii="Calibri" w:hAnsi="Calibri" w:cs="Calibri"/>
+          <w:sz w:val="22"/>
+          <w:szCs w:val="22"/>
+        </w:rPr>
+      </w:pPr>
+      <w:r>
+        <w:rPr>
+          <w:rFonts w:ascii="Calibri" w:hAnsi="Calibri" w:cs="Calibri"/>
+          <w:sz w:val="22"/>
+          <w:szCs w:val="22"/>
+        </w:rPr>
+        <w:t>("link in bio for coaches", "sell digital products without a website",</w:t>
+      </w:r>
+    </w:p>
+    <w:p>
+      <w:pPr>
+        <w:pStyle w:val="NormalWeb"/>
+        <w:rPr>
+          <w:rFonts w:ascii="Calibri" w:hAnsi="Calibri" w:cs="Calibri"/>
+          <w:sz w:val="22"/>
+          <w:szCs w:val="22"/>
+        </w:rPr>
+      </w:pPr>
+      <w:r>
+        <w:rPr>
+          <w:rFonts w:ascii="Calibri" w:hAnsi="Calibri" w:cs="Calibri"/>
+          <w:sz w:val="22"/>
+          <w:szCs w:val="22"/>
+        </w:rPr>
+        <w:t>"CreatorOS vs Linktree", "email list for creators"). Resubmit sitemap,</w:t>
+      </w:r>
+    </w:p>
+    <w:p>
+      <w:pPr>
+        <w:pStyle w:val="NormalWeb"/>
+        <w:rPr>
+          <w:rFonts w:ascii="Calibri" w:hAnsi="Calibri" w:cs="Calibri"/>
+          <w:sz w:val="22"/>
+          <w:szCs w:val="22"/>
+        </w:rPr>
+      </w:pPr>
+      <w:r>
+        <w:rPr>
+          <w:rFonts w:ascii="Calibri" w:hAnsi="Calibri" w:cs="Calibri"/>
+          <w:sz w:val="22"/>
+          <w:szCs w:val="22"/>
+        </w:rPr>
+        <w:t xml:space="preserve">add </w:t>
+      </w:r>
+      <w:r>
+        <w:rPr>
+          <w:rStyle w:val="HTMLCode"/>
+        </w:rPr>
+        <w:t>www</w:t>
+      </w:r>
+      <w:r>
+        <w:rPr>
+          <w:rFonts w:ascii="Calibri" w:hAnsi="Calibri" w:cs="Calibri"/>
+          <w:sz w:val="22"/>
+          <w:szCs w:val="22"/>
+        </w:rPr>
+        <w:t>→apex redirect first.</w:t>
       </w:r>
     </w:p>
     <w:p>
@@ -523,26 +1091,60 @@
           <w:sz w:val="22"/>
           <w:szCs w:val="22"/>
         </w:rPr>
-        <w:t>Small agencies/teams (Business $99):</w:t>
-      </w:r>
-      <w:r>
-        <w:rPr>
-          <w:rFonts w:ascii="Calibri" w:hAnsi="Calibri" w:cs="Calibri"/>
-          <w:sz w:val="22"/>
-          <w:szCs w:val="22"/>
-        </w:rPr>
-        <w:t xml:space="preserve"> white-label, team seats, client pages.</w:t>
-      </w:r>
-    </w:p>
-    <w:p>
-      <w:pPr>
-        <w:pStyle w:val="NormalWeb"/>
-        <w:rPr>
-          <w:rFonts w:ascii="Calibri" w:hAnsi="Calibri" w:cs="Calibri"/>
-          <w:sz w:val="22"/>
-          <w:szCs w:val="22"/>
-        </w:rPr>
-      </w:pPr>
+        <w:t>Email nurture (we own the list):</w:t>
+      </w:r>
+      <w:r>
+        <w:rPr>
+          <w:rFonts w:ascii="Calibri" w:hAnsi="Calibri" w:cs="Calibri"/>
+          <w:sz w:val="22"/>
+          <w:szCs w:val="22"/>
+        </w:rPr>
+        <w:t xml:space="preserve"> welcome serie</w:t>
+      </w:r>
+      <w:r>
+        <w:rPr>
+          <w:rFonts w:ascii="Calibri" w:hAnsi="Calibri" w:cs="Calibri"/>
+          <w:sz w:val="22"/>
+          <w:szCs w:val="22"/>
+        </w:rPr>
+        <w:t>s (day 0/2/5/9) → activation</w:t>
+      </w:r>
+    </w:p>
+    <w:p>
+      <w:pPr>
+        <w:pStyle w:val="NormalWeb"/>
+        <w:rPr>
+          <w:rFonts w:ascii="Calibri" w:hAnsi="Calibri" w:cs="Calibri"/>
+          <w:sz w:val="22"/>
+          <w:szCs w:val="22"/>
+        </w:rPr>
+      </w:pPr>
+      <w:r>
+        <w:rPr>
+          <w:rFonts w:ascii="Calibri" w:hAnsi="Calibri" w:cs="Calibri"/>
+          <w:sz w:val="22"/>
+          <w:szCs w:val="22"/>
+        </w:rPr>
+        <w:t>checklist, template drops, upgrade nudge at limit-hit. Dogfood our own tool.</w:t>
+      </w:r>
+    </w:p>
+    <w:p>
+      <w:pPr>
+        <w:pStyle w:val="NormalWeb"/>
+        <w:rPr>
+          <w:rFonts w:ascii="Calibri" w:hAnsi="Calibri" w:cs="Calibri"/>
+          <w:sz w:val="22"/>
+          <w:szCs w:val="22"/>
+        </w:rPr>
+      </w:pPr>
+      <w:r>
+        <w:rPr>
+          <w:rFonts w:ascii="Calibri" w:hAnsi="Calibri" w:cs="Calibri"/>
+          <w:sz w:val="22"/>
+          <w:szCs w:val="22"/>
+        </w:rPr>
+        <w:t xml:space="preserve">4. </w:t>
+      </w:r>
       <w:r>
         <w:rPr>
           <w:rStyle w:val="Strong"/>
@@ -550,33 +1152,147 @@
           <w:sz w:val="22"/>
           <w:szCs w:val="22"/>
         </w:rPr>
-        <w:t>Anti-ICP (say no early):</w:t>
-      </w:r>
-      <w:r>
-        <w:rPr>
-          <w:rFonts w:ascii="Calibri" w:hAnsi="Calibri" w:cs="Calibri"/>
-          <w:sz w:val="22"/>
-          <w:szCs w:val="22"/>
-        </w:rPr>
-        <w:t xml:space="preserve"> enterprises needing SSO/SLA, physical-goods sellers</w:t>
-      </w:r>
-    </w:p>
-    <w:p>
-      <w:pPr>
-        <w:pStyle w:val="NormalWeb"/>
-        <w:rPr>
-          <w:rFonts w:ascii="Calibri" w:hAnsi="Calibri" w:cs="Calibri"/>
-          <w:sz w:val="22"/>
-          <w:szCs w:val="22"/>
-        </w:rPr>
-      </w:pPr>
-      <w:r>
-        <w:rPr>
-          <w:rFonts w:ascii="Calibri" w:hAnsi="Calibri" w:cs="Calibri"/>
-          <w:sz w:val="22"/>
-          <w:szCs w:val="22"/>
-        </w:rPr>
-        <w:t>needing shipping, developers wanting API-first headless.</w:t>
+        <w:t>Partnerships/affiliates:</w:t>
+      </w:r>
+      <w:r>
+        <w:rPr>
+          <w:rFonts w:ascii="Calibri" w:hAnsi="Calibri" w:cs="Calibri"/>
+          <w:sz w:val="22"/>
+          <w:szCs w:val="22"/>
+        </w:rPr>
+        <w:t xml:space="preserve"> micro-creator affiliates (20–30% recurring),</w:t>
+      </w:r>
+    </w:p>
+    <w:p>
+      <w:pPr>
+        <w:pStyle w:val="NormalWeb"/>
+        <w:rPr>
+          <w:rFonts w:ascii="Calibri" w:hAnsi="Calibri" w:cs="Calibri"/>
+          <w:sz w:val="22"/>
+          <w:szCs w:val="22"/>
+        </w:rPr>
+      </w:pPr>
+      <w:r>
+        <w:rPr>
+          <w:rFonts w:ascii="Calibri" w:hAnsi="Calibri" w:cs="Calibri"/>
+          <w:sz w:val="22"/>
+          <w:szCs w:val="22"/>
+        </w:rPr>
+        <w:t>coach communities, template creators. Launch affiliate terms before scaling.</w:t>
+      </w:r>
+    </w:p>
+    <w:p>
+      <w:pPr>
+        <w:pStyle w:val="NormalWeb"/>
+        <w:rPr>
+          <w:rFonts w:ascii="Calibri" w:hAnsi="Calibri" w:cs="Calibri"/>
+          <w:sz w:val="22"/>
+          <w:szCs w:val="22"/>
+        </w:rPr>
+      </w:pPr>
+      <w:r>
+        <w:rPr>
+          <w:rFonts w:ascii="Calibri" w:hAnsi="Calibri" w:cs="Calibri"/>
+          <w:sz w:val="22"/>
+          <w:szCs w:val="22"/>
+        </w:rPr>
+        <w:t xml:space="preserve">5. </w:t>
+      </w:r>
+      <w:r>
+        <w:rPr>
+          <w:rStyle w:val="Strong"/>
+          <w:rFonts w:ascii="Calibri" w:hAnsi="Calibri" w:cs="Calibri"/>
+          <w:sz w:val="22"/>
+          <w:szCs w:val="22"/>
+        </w:rPr>
+        <w:t>Paid (only after funnel works):</w:t>
+      </w:r>
+      <w:r>
+        <w:rPr>
+          <w:rFonts w:ascii="Calibri" w:hAnsi="Calibri" w:cs="Calibri"/>
+          <w:sz w:val="22"/>
+          <w:szCs w:val="22"/>
+        </w:rPr>
+        <w:t xml:space="preserve"> small tests ($10–20/day) on Meta/YouTube</w:t>
+      </w:r>
+    </w:p>
+    <w:p>
+      <w:pPr>
+        <w:pStyle w:val="NormalWeb"/>
+        <w:rPr>
+          <w:rFonts w:ascii="Calibri" w:hAnsi="Calibri" w:cs="Calibri"/>
+          <w:sz w:val="22"/>
+          <w:szCs w:val="22"/>
+        </w:rPr>
+      </w:pPr>
+      <w:r>
+        <w:rPr>
+          <w:rFonts w:ascii="Calibri" w:hAnsi="Calibri" w:cs="Calibri"/>
+          <w:sz w:val="22"/>
+          <w:szCs w:val="22"/>
+        </w:rPr>
+        <w:t>retargeting site visitors + free users near limits. Kill fast if CAC &gt; 6-month ARPU.</w:t>
+      </w:r>
+    </w:p>
+    <w:p>
+      <w:pPr>
+        <w:pStyle w:val="NormalWeb"/>
+        <w:rPr>
+          <w:rFonts w:ascii="Calibri" w:hAnsi="Calibri" w:cs="Calibri"/>
+          <w:sz w:val="22"/>
+          <w:szCs w:val="22"/>
+        </w:rPr>
+      </w:pPr>
+      <w:r>
+        <w:rPr>
+          <w:rFonts w:ascii="Calibri" w:hAnsi="Calibri" w:cs="Calibri"/>
+          <w:sz w:val="22"/>
+          <w:szCs w:val="22"/>
+        </w:rPr>
+        <w:t xml:space="preserve">6. </w:t>
+      </w:r>
+      <w:r>
+        <w:rPr>
+          <w:rStyle w:val="Strong"/>
+          <w:rFonts w:ascii="Calibri" w:hAnsi="Calibri" w:cs="Calibri"/>
+          <w:sz w:val="22"/>
+          <w:szCs w:val="22"/>
+        </w:rPr>
+        <w:t>Marketplaces/directories:</w:t>
+      </w:r>
+      <w:r>
+        <w:rPr>
+          <w:rFonts w:ascii="Calibri" w:hAnsi="Calibri" w:cs="Calibri"/>
+          <w:sz w:val="22"/>
+          <w:szCs w:val="22"/>
+        </w:rPr>
+        <w:t xml:space="preserve"> Product Hunt, AppSumo-style lifetime deal only if</w:t>
+      </w:r>
+    </w:p>
+    <w:p>
+      <w:pPr>
+        <w:pStyle w:val="NormalWeb"/>
+        <w:rPr>
+          <w:rFonts w:ascii="Calibri" w:hAnsi="Calibri" w:cs="Calibri"/>
+          <w:sz w:val="22"/>
+          <w:szCs w:val="22"/>
+        </w:rPr>
+      </w:pPr>
+      <w:r>
+        <w:rPr>
+          <w:rFonts w:ascii="Calibri" w:hAnsi="Calibri" w:cs="Calibri"/>
+          <w:sz w:val="22"/>
+          <w:szCs w:val="22"/>
+        </w:rPr>
+        <w:t>cash needed (not</w:t>
+      </w:r>
+      <w:r>
+        <w:rPr>
+          <w:rFonts w:ascii="Calibri" w:hAnsi="Calibri" w:cs="Calibri"/>
+          <w:sz w:val="22"/>
+          <w:szCs w:val="22"/>
+        </w:rPr>
+        <w:t>e: LTD buyers churn/never upgrade — use sparingly), SaaS directories.</w:t>
       </w:r>
     </w:p>
     <w:p>
@@ -590,708 +1306,7 @@
         <w:rPr>
           <w:rFonts w:ascii="Calibri" w:eastAsia="Times New Roman" w:hAnsi="Calibri" w:cs="Calibri"/>
         </w:rPr>
-        <w:t>3</w:t>
-      </w:r>
-      <w:r>
-        <w:rPr>
-          <w:rFonts w:ascii="Calibri" w:eastAsia="Times New Roman" w:hAnsi="Calibri" w:cs="Calibri"/>
-        </w:rPr>
-        <w:t>. Funnel and conversion path</w:t>
-      </w:r>
-    </w:p>
-    <w:p>
-      <w:pPr>
-        <w:pStyle w:val="NormalWeb"/>
-        <w:rPr>
-          <w:rFonts w:ascii="Calibri" w:hAnsi="Calibri" w:cs="Calibri"/>
-          <w:sz w:val="22"/>
-          <w:szCs w:val="22"/>
-        </w:rPr>
-      </w:pPr>
-      <w:r>
-        <w:rPr>
-          <w:rFonts w:ascii="Calibri" w:hAnsi="Calibri" w:cs="Calibri"/>
-          <w:sz w:val="22"/>
-          <w:szCs w:val="22"/>
-        </w:rPr>
-        <w:t>Landing (</w:t>
-      </w:r>
-      <w:r>
-        <w:rPr>
-          <w:rStyle w:val="HTMLCode"/>
-        </w:rPr>
-        <w:t>/</w:t>
-      </w:r>
-      <w:r>
-        <w:rPr>
-          <w:rFonts w:ascii="Calibri" w:hAnsi="Calibri" w:cs="Calibri"/>
-          <w:sz w:val="22"/>
-          <w:szCs w:val="22"/>
-        </w:rPr>
-        <w:t>) → Pricing (</w:t>
-      </w:r>
-      <w:r>
-        <w:rPr>
-          <w:rStyle w:val="HTMLCode"/>
-        </w:rPr>
-        <w:t>/pricing</w:t>
-      </w:r>
-      <w:r>
-        <w:rPr>
-          <w:rFonts w:ascii="Calibri" w:hAnsi="Calibri" w:cs="Calibri"/>
-          <w:sz w:val="22"/>
-          <w:szCs w:val="22"/>
-        </w:rPr>
-        <w:t>) → Register (free, consent checkbox) →</w:t>
-      </w:r>
-    </w:p>
-    <w:p>
-      <w:pPr>
-        <w:pStyle w:val="NormalWeb"/>
-        <w:rPr>
-          <w:rFonts w:ascii="Calibri" w:hAnsi="Calibri" w:cs="Calibri"/>
-          <w:sz w:val="22"/>
-          <w:szCs w:val="22"/>
-        </w:rPr>
-      </w:pPr>
-      <w:r>
-        <w:rPr>
-          <w:rFonts w:ascii="Calibri" w:hAnsi="Calibri" w:cs="Calibri"/>
-          <w:sz w:val="22"/>
-          <w:szCs w:val="22"/>
-        </w:rPr>
-        <w:t>dashboard onboarding → first win checklist:</w:t>
-      </w:r>
-    </w:p>
-    <w:p>
-      <w:pPr>
-        <w:pStyle w:val="NormalWeb"/>
-        <w:rPr>
-          <w:rFonts w:ascii="Calibri" w:hAnsi="Calibri" w:cs="Calibri"/>
-          <w:sz w:val="22"/>
-          <w:szCs w:val="22"/>
-        </w:rPr>
-      </w:pPr>
-      <w:r>
-        <w:rPr>
-          <w:rFonts w:ascii="Calibri" w:hAnsi="Calibri" w:cs="Calibri"/>
-          <w:sz w:val="22"/>
-          <w:szCs w:val="22"/>
-        </w:rPr>
-        <w:t>1. publish bio page, 2. add 3 links, 3. add 1 product or service,</w:t>
-      </w:r>
-    </w:p>
-    <w:p>
-      <w:pPr>
-        <w:pStyle w:val="NormalWeb"/>
-        <w:rPr>
-          <w:rFonts w:ascii="Calibri" w:hAnsi="Calibri" w:cs="Calibri"/>
-          <w:sz w:val="22"/>
-          <w:szCs w:val="22"/>
-        </w:rPr>
-      </w:pPr>
-      <w:r>
-        <w:rPr>
-          <w:rFonts w:ascii="Calibri" w:hAnsi="Calibri" w:cs="Calibri"/>
-          <w:sz w:val="22"/>
-          <w:szCs w:val="22"/>
-        </w:rPr>
-        <w:t>4. import/collect 10 contacts, 5. send first e</w:t>
-      </w:r>
-      <w:r>
-        <w:rPr>
-          <w:rFonts w:ascii="Calibri" w:hAnsi="Calibri" w:cs="Calibri"/>
-          <w:sz w:val="22"/>
-          <w:szCs w:val="22"/>
-        </w:rPr>
-        <w:t>mail.</w:t>
-      </w:r>
-    </w:p>
-    <w:p>
-      <w:pPr>
-        <w:pStyle w:val="NormalWeb"/>
-        <w:rPr>
-          <w:rFonts w:ascii="Calibri" w:hAnsi="Calibri" w:cs="Calibri"/>
-          <w:sz w:val="22"/>
-          <w:szCs w:val="22"/>
-        </w:rPr>
-      </w:pPr>
-      <w:r>
-        <w:rPr>
-          <w:rFonts w:ascii="Calibri" w:hAnsi="Calibri" w:cs="Calibri"/>
-          <w:sz w:val="22"/>
-          <w:szCs w:val="22"/>
-        </w:rPr>
-        <w:t>Upgrade triggers: hit free limits (1 page / 5 links / 10 contacts / 1k views),</w:t>
-      </w:r>
-    </w:p>
-    <w:p>
-      <w:pPr>
-        <w:pStyle w:val="NormalWeb"/>
-        <w:rPr>
-          <w:rFonts w:ascii="Calibri" w:hAnsi="Calibri" w:cs="Calibri"/>
-          <w:sz w:val="22"/>
-          <w:szCs w:val="22"/>
-        </w:rPr>
-      </w:pPr>
-      <w:r>
-        <w:rPr>
-          <w:rFonts w:ascii="Calibri" w:hAnsi="Calibri" w:cs="Calibri"/>
-          <w:sz w:val="22"/>
-          <w:szCs w:val="22"/>
-        </w:rPr>
-        <w:t>custom domain, email automation, AI credits.</w:t>
-      </w:r>
-    </w:p>
-    <w:p>
-      <w:pPr>
-        <w:pStyle w:val="NormalWeb"/>
-        <w:rPr>
-          <w:rFonts w:ascii="Calibri" w:hAnsi="Calibri" w:cs="Calibri"/>
-          <w:sz w:val="22"/>
-          <w:szCs w:val="22"/>
-        </w:rPr>
-      </w:pPr>
-      <w:r>
-        <w:rPr>
-          <w:rStyle w:val="Strong"/>
-          <w:rFonts w:ascii="Calibri" w:hAnsi="Calibri" w:cs="Calibri"/>
-          <w:sz w:val="22"/>
-          <w:szCs w:val="22"/>
-        </w:rPr>
-        <w:t>North-star metric:</w:t>
-      </w:r>
-      <w:r>
-        <w:rPr>
-          <w:rFonts w:ascii="Calibri" w:hAnsi="Calibri" w:cs="Calibri"/>
-          <w:sz w:val="22"/>
-          <w:szCs w:val="22"/>
-        </w:rPr>
-        <w:t xml:space="preserve"> activated free workspaces (bio published + ≥1 product/service).</w:t>
-      </w:r>
-    </w:p>
-    <w:p>
-      <w:pPr>
-        <w:pStyle w:val="NormalWeb"/>
-        <w:rPr>
-          <w:rFonts w:ascii="Calibri" w:hAnsi="Calibri" w:cs="Calibri"/>
-          <w:sz w:val="22"/>
-          <w:szCs w:val="22"/>
-        </w:rPr>
-      </w:pPr>
-      <w:r>
-        <w:rPr>
-          <w:rStyle w:val="Strong"/>
-          <w:rFonts w:ascii="Calibri" w:hAnsi="Calibri" w:cs="Calibri"/>
-          <w:sz w:val="22"/>
-          <w:szCs w:val="22"/>
-        </w:rPr>
-        <w:t>Money metrics:</w:t>
-      </w:r>
-      <w:r>
-        <w:rPr>
-          <w:rFonts w:ascii="Calibri" w:hAnsi="Calibri" w:cs="Calibri"/>
-          <w:sz w:val="22"/>
-          <w:szCs w:val="22"/>
-        </w:rPr>
-        <w:t xml:space="preserve"> </w:t>
-      </w:r>
-      <w:r>
-        <w:rPr>
-          <w:rFonts w:ascii="Calibri" w:hAnsi="Calibri" w:cs="Calibri"/>
-          <w:sz w:val="22"/>
-          <w:szCs w:val="22"/>
-        </w:rPr>
-        <w:t>free→paid %, ARPU, MRR, churn, CAC payback.</w:t>
-      </w:r>
-    </w:p>
-    <w:p>
-      <w:pPr>
-        <w:pStyle w:val="NormalWeb"/>
-        <w:rPr>
-          <w:rFonts w:ascii="Calibri" w:hAnsi="Calibri" w:cs="Calibri"/>
-          <w:sz w:val="22"/>
-          <w:szCs w:val="22"/>
-        </w:rPr>
-      </w:pPr>
-      <w:r>
-        <w:rPr>
-          <w:rFonts w:ascii="Calibri" w:hAnsi="Calibri" w:cs="Calibri"/>
-          <w:sz w:val="22"/>
-          <w:szCs w:val="22"/>
-        </w:rPr>
-        <w:t>Target guardrails (first 90 days): activation ≥25%, free→Creator ≥3%,</w:t>
-      </w:r>
-    </w:p>
-    <w:p>
-      <w:pPr>
-        <w:pStyle w:val="NormalWeb"/>
-        <w:rPr>
-          <w:rFonts w:ascii="Calibri" w:hAnsi="Calibri" w:cs="Calibri"/>
-          <w:sz w:val="22"/>
-          <w:szCs w:val="22"/>
-        </w:rPr>
-      </w:pPr>
-      <w:r>
-        <w:rPr>
-          <w:rFonts w:ascii="Calibri" w:hAnsi="Calibri" w:cs="Calibri"/>
-          <w:sz w:val="22"/>
-          <w:szCs w:val="22"/>
-        </w:rPr>
-        <w:t>email deliverability ≥98%, site p95 &lt; 2s, refund rate &lt;2%.</w:t>
-      </w:r>
-    </w:p>
-    <w:p>
-      <w:pPr>
-        <w:pStyle w:val="Heading2"/>
-        <w:rPr>
-          <w:rFonts w:ascii="Calibri" w:eastAsia="Times New Roman" w:hAnsi="Calibri" w:cs="Calibri"/>
-        </w:rPr>
-      </w:pPr>
-      <w:r>
-        <w:rPr>
-          <w:rFonts w:ascii="Calibri" w:eastAsia="Times New Roman" w:hAnsi="Calibri" w:cs="Calibri"/>
-        </w:rPr>
-        <w:t>4. Channels (ranked by effort/return for a solo founder)</w:t>
-      </w:r>
-    </w:p>
-    <w:p>
-      <w:pPr>
-        <w:pStyle w:val="NormalWeb"/>
-        <w:rPr>
-          <w:rFonts w:ascii="Calibri" w:hAnsi="Calibri" w:cs="Calibri"/>
-          <w:sz w:val="22"/>
-          <w:szCs w:val="22"/>
-        </w:rPr>
-      </w:pPr>
-      <w:r>
-        <w:rPr>
-          <w:rFonts w:ascii="Calibri" w:hAnsi="Calibri" w:cs="Calibri"/>
-          <w:sz w:val="22"/>
-          <w:szCs w:val="22"/>
-        </w:rPr>
-        <w:t xml:space="preserve">1. </w:t>
-      </w:r>
-      <w:r>
-        <w:rPr>
-          <w:rStyle w:val="Strong"/>
-          <w:rFonts w:ascii="Calibri" w:hAnsi="Calibri" w:cs="Calibri"/>
-          <w:sz w:val="22"/>
-          <w:szCs w:val="22"/>
-        </w:rPr>
-        <w:t>Founder-led short video</w:t>
-      </w:r>
-      <w:r>
-        <w:rPr>
-          <w:rStyle w:val="Strong"/>
-          <w:rFonts w:ascii="Calibri" w:hAnsi="Calibri" w:cs="Calibri"/>
-          <w:sz w:val="22"/>
-          <w:szCs w:val="22"/>
-        </w:rPr>
-        <w:t xml:space="preserve"> (highest ROI):</w:t>
-      </w:r>
-      <w:r>
-        <w:rPr>
-          <w:rFonts w:ascii="Calibri" w:hAnsi="Calibri" w:cs="Calibri"/>
-          <w:sz w:val="22"/>
-          <w:szCs w:val="22"/>
-        </w:rPr>
-        <w:t xml:space="preserve"> daily 30–60s builds/tips on</w:t>
-      </w:r>
-    </w:p>
-    <w:p>
-      <w:pPr>
-        <w:pStyle w:val="NormalWeb"/>
-        <w:rPr>
-          <w:rFonts w:ascii="Calibri" w:hAnsi="Calibri" w:cs="Calibri"/>
-          <w:sz w:val="22"/>
-          <w:szCs w:val="22"/>
-        </w:rPr>
-      </w:pPr>
-      <w:r>
-        <w:rPr>
-          <w:rFonts w:ascii="Calibri" w:hAnsi="Calibri" w:cs="Calibri"/>
-          <w:sz w:val="22"/>
-          <w:szCs w:val="22"/>
-        </w:rPr>
-        <w:t>YouTube Shorts, Instagram Reels, TikTok. Format: problem → 20s build in</w:t>
-      </w:r>
-    </w:p>
-    <w:p>
-      <w:pPr>
-        <w:pStyle w:val="NormalWeb"/>
-        <w:rPr>
-          <w:rFonts w:ascii="Calibri" w:hAnsi="Calibri" w:cs="Calibri"/>
-          <w:sz w:val="22"/>
-          <w:szCs w:val="22"/>
-        </w:rPr>
-      </w:pPr>
-      <w:r>
-        <w:rPr>
-          <w:rFonts w:ascii="Calibri" w:hAnsi="Calibri" w:cs="Calibri"/>
-          <w:sz w:val="22"/>
-          <w:szCs w:val="22"/>
-        </w:rPr>
-        <w:t>CreatorOS → result. CTA: free link in bio.</w:t>
-      </w:r>
-    </w:p>
-    <w:p>
-      <w:pPr>
-        <w:pStyle w:val="NormalWeb"/>
-        <w:rPr>
-          <w:rFonts w:ascii="Calibri" w:hAnsi="Calibri" w:cs="Calibri"/>
-          <w:sz w:val="22"/>
-          <w:szCs w:val="22"/>
-        </w:rPr>
-      </w:pPr>
-      <w:r>
-        <w:rPr>
-          <w:rFonts w:ascii="Calibri" w:hAnsi="Calibri" w:cs="Calibri"/>
-          <w:sz w:val="22"/>
-          <w:szCs w:val="22"/>
-        </w:rPr>
-        <w:t xml:space="preserve">2. </w:t>
-      </w:r>
-      <w:r>
-        <w:rPr>
-          <w:rStyle w:val="Strong"/>
-          <w:rFonts w:ascii="Calibri" w:hAnsi="Calibri" w:cs="Calibri"/>
-          <w:sz w:val="22"/>
-          <w:szCs w:val="22"/>
-        </w:rPr>
-        <w:t>SEO content (compounds):</w:t>
-      </w:r>
-      <w:r>
-        <w:rPr>
-          <w:rFonts w:ascii="Calibri" w:hAnsi="Calibri" w:cs="Calibri"/>
-          <w:sz w:val="22"/>
-          <w:szCs w:val="22"/>
-        </w:rPr>
-        <w:t xml:space="preserve"> comparison + how-to posts</w:t>
-      </w:r>
-    </w:p>
-    <w:p>
-      <w:pPr>
-        <w:pStyle w:val="NormalWeb"/>
-        <w:rPr>
-          <w:rFonts w:ascii="Calibri" w:hAnsi="Calibri" w:cs="Calibri"/>
-          <w:sz w:val="22"/>
-          <w:szCs w:val="22"/>
-        </w:rPr>
-      </w:pPr>
-      <w:r>
-        <w:rPr>
-          <w:rFonts w:ascii="Calibri" w:hAnsi="Calibri" w:cs="Calibri"/>
-          <w:sz w:val="22"/>
-          <w:szCs w:val="22"/>
-        </w:rPr>
-        <w:t>("link in bio for coaches", "sell digital p</w:t>
-      </w:r>
-      <w:r>
-        <w:rPr>
-          <w:rFonts w:ascii="Calibri" w:hAnsi="Calibri" w:cs="Calibri"/>
-          <w:sz w:val="22"/>
-          <w:szCs w:val="22"/>
-        </w:rPr>
-        <w:t>roducts without a website",</w:t>
-      </w:r>
-    </w:p>
-    <w:p>
-      <w:pPr>
-        <w:pStyle w:val="NormalWeb"/>
-        <w:rPr>
-          <w:rFonts w:ascii="Calibri" w:hAnsi="Calibri" w:cs="Calibri"/>
-          <w:sz w:val="22"/>
-          <w:szCs w:val="22"/>
-        </w:rPr>
-      </w:pPr>
-      <w:r>
-        <w:rPr>
-          <w:rFonts w:ascii="Calibri" w:hAnsi="Calibri" w:cs="Calibri"/>
-          <w:sz w:val="22"/>
-          <w:szCs w:val="22"/>
-        </w:rPr>
-        <w:t>"CreatorOS vs Linktree", "email list for creators"). Resubmit sitemap,</w:t>
-      </w:r>
-    </w:p>
-    <w:p>
-      <w:pPr>
-        <w:pStyle w:val="NormalWeb"/>
-        <w:rPr>
-          <w:rFonts w:ascii="Calibri" w:hAnsi="Calibri" w:cs="Calibri"/>
-          <w:sz w:val="22"/>
-          <w:szCs w:val="22"/>
-        </w:rPr>
-      </w:pPr>
-      <w:r>
-        <w:rPr>
-          <w:rFonts w:ascii="Calibri" w:hAnsi="Calibri" w:cs="Calibri"/>
-          <w:sz w:val="22"/>
-          <w:szCs w:val="22"/>
-        </w:rPr>
-        <w:t xml:space="preserve">add </w:t>
-      </w:r>
-      <w:r>
-        <w:rPr>
-          <w:rStyle w:val="HTMLCode"/>
-        </w:rPr>
-        <w:t>www</w:t>
-      </w:r>
-      <w:r>
-        <w:rPr>
-          <w:rFonts w:ascii="Calibri" w:hAnsi="Calibri" w:cs="Calibri"/>
-          <w:sz w:val="22"/>
-          <w:szCs w:val="22"/>
-        </w:rPr>
-        <w:t>→apex redirect first.</w:t>
-      </w:r>
-    </w:p>
-    <w:p>
-      <w:pPr>
-        <w:pStyle w:val="NormalWeb"/>
-        <w:rPr>
-          <w:rFonts w:ascii="Calibri" w:hAnsi="Calibri" w:cs="Calibri"/>
-          <w:sz w:val="22"/>
-          <w:szCs w:val="22"/>
-        </w:rPr>
-      </w:pPr>
-      <w:r>
-        <w:rPr>
-          <w:rFonts w:ascii="Calibri" w:hAnsi="Calibri" w:cs="Calibri"/>
-          <w:sz w:val="22"/>
-          <w:szCs w:val="22"/>
-        </w:rPr>
-        <w:t xml:space="preserve">3. </w:t>
-      </w:r>
-      <w:r>
-        <w:rPr>
-          <w:rStyle w:val="Strong"/>
-          <w:rFonts w:ascii="Calibri" w:hAnsi="Calibri" w:cs="Calibri"/>
-          <w:sz w:val="22"/>
-          <w:szCs w:val="22"/>
-        </w:rPr>
-        <w:t>Email nurture (we own the list):</w:t>
-      </w:r>
-      <w:r>
-        <w:rPr>
-          <w:rFonts w:ascii="Calibri" w:hAnsi="Calibri" w:cs="Calibri"/>
-          <w:sz w:val="22"/>
-          <w:szCs w:val="22"/>
-        </w:rPr>
-        <w:t xml:space="preserve"> welcome series (day 0/2/5/9) → activation</w:t>
-      </w:r>
-    </w:p>
-    <w:p>
-      <w:pPr>
-        <w:pStyle w:val="NormalWeb"/>
-        <w:rPr>
-          <w:rFonts w:ascii="Calibri" w:hAnsi="Calibri" w:cs="Calibri"/>
-          <w:sz w:val="22"/>
-          <w:szCs w:val="22"/>
-        </w:rPr>
-      </w:pPr>
-      <w:r>
-        <w:rPr>
-          <w:rFonts w:ascii="Calibri" w:hAnsi="Calibri" w:cs="Calibri"/>
-          <w:sz w:val="22"/>
-          <w:szCs w:val="22"/>
-        </w:rPr>
-        <w:t>checklist, template drops, upgrade nudge at limit-</w:t>
-      </w:r>
-      <w:r>
-        <w:rPr>
-          <w:rFonts w:ascii="Calibri" w:hAnsi="Calibri" w:cs="Calibri"/>
-          <w:sz w:val="22"/>
-          <w:szCs w:val="22"/>
-        </w:rPr>
-        <w:t>hit. Dogfood our own tool.</w:t>
-      </w:r>
-    </w:p>
-    <w:p>
-      <w:pPr>
-        <w:pStyle w:val="NormalWeb"/>
-        <w:rPr>
-          <w:rFonts w:ascii="Calibri" w:hAnsi="Calibri" w:cs="Calibri"/>
-          <w:sz w:val="22"/>
-          <w:szCs w:val="22"/>
-        </w:rPr>
-      </w:pPr>
-      <w:r>
-        <w:rPr>
-          <w:rFonts w:ascii="Calibri" w:hAnsi="Calibri" w:cs="Calibri"/>
-          <w:sz w:val="22"/>
-          <w:szCs w:val="22"/>
-        </w:rPr>
-        <w:t xml:space="preserve">4. </w:t>
-      </w:r>
-      <w:r>
-        <w:rPr>
-          <w:rStyle w:val="Strong"/>
-          <w:rFonts w:ascii="Calibri" w:hAnsi="Calibri" w:cs="Calibri"/>
-          <w:sz w:val="22"/>
-          <w:szCs w:val="22"/>
-        </w:rPr>
-        <w:t>Partnerships/affiliates:</w:t>
-      </w:r>
-      <w:r>
-        <w:rPr>
-          <w:rFonts w:ascii="Calibri" w:hAnsi="Calibri" w:cs="Calibri"/>
-          <w:sz w:val="22"/>
-          <w:szCs w:val="22"/>
-        </w:rPr>
-        <w:t xml:space="preserve"> micro-creator affiliates (20–30% recurring),</w:t>
-      </w:r>
-    </w:p>
-    <w:p>
-      <w:pPr>
-        <w:pStyle w:val="NormalWeb"/>
-        <w:rPr>
-          <w:rFonts w:ascii="Calibri" w:hAnsi="Calibri" w:cs="Calibri"/>
-          <w:sz w:val="22"/>
-          <w:szCs w:val="22"/>
-        </w:rPr>
-      </w:pPr>
-      <w:r>
-        <w:rPr>
-          <w:rFonts w:ascii="Calibri" w:hAnsi="Calibri" w:cs="Calibri"/>
-          <w:sz w:val="22"/>
-          <w:szCs w:val="22"/>
-        </w:rPr>
-        <w:t>coach communities, template creators. Launch affiliate terms before scaling.</w:t>
-      </w:r>
-    </w:p>
-    <w:p>
-      <w:pPr>
-        <w:pStyle w:val="NormalWeb"/>
-        <w:rPr>
-          <w:rFonts w:ascii="Calibri" w:hAnsi="Calibri" w:cs="Calibri"/>
-          <w:sz w:val="22"/>
-          <w:szCs w:val="22"/>
-        </w:rPr>
-      </w:pPr>
-      <w:r>
-        <w:rPr>
-          <w:rFonts w:ascii="Calibri" w:hAnsi="Calibri" w:cs="Calibri"/>
-          <w:sz w:val="22"/>
-          <w:szCs w:val="22"/>
-        </w:rPr>
-        <w:t xml:space="preserve">5. </w:t>
-      </w:r>
-      <w:r>
-        <w:rPr>
-          <w:rStyle w:val="Strong"/>
-          <w:rFonts w:ascii="Calibri" w:hAnsi="Calibri" w:cs="Calibri"/>
-          <w:sz w:val="22"/>
-          <w:szCs w:val="22"/>
-        </w:rPr>
-        <w:t>Paid (only after funnel works):</w:t>
-      </w:r>
-      <w:r>
-        <w:rPr>
-          <w:rFonts w:ascii="Calibri" w:hAnsi="Calibri" w:cs="Calibri"/>
-          <w:sz w:val="22"/>
-          <w:szCs w:val="22"/>
-        </w:rPr>
-        <w:t xml:space="preserve"> small tests ($10–20/day) on Meta/YouTube</w:t>
-      </w:r>
-    </w:p>
-    <w:p>
-      <w:pPr>
-        <w:pStyle w:val="NormalWeb"/>
-        <w:rPr>
-          <w:rFonts w:ascii="Calibri" w:hAnsi="Calibri" w:cs="Calibri"/>
-          <w:sz w:val="22"/>
-          <w:szCs w:val="22"/>
-        </w:rPr>
-      </w:pPr>
-      <w:r>
-        <w:rPr>
-          <w:rFonts w:ascii="Calibri" w:hAnsi="Calibri" w:cs="Calibri"/>
-          <w:sz w:val="22"/>
-          <w:szCs w:val="22"/>
-        </w:rPr>
-        <w:t>ret</w:t>
-      </w:r>
-      <w:r>
-        <w:rPr>
-          <w:rFonts w:ascii="Calibri" w:hAnsi="Calibri" w:cs="Calibri"/>
-          <w:sz w:val="22"/>
-          <w:szCs w:val="22"/>
-        </w:rPr>
-        <w:t>argeting site visitors + free users near limits. Kill fast if CAC &gt; 6-month ARPU.</w:t>
-      </w:r>
-    </w:p>
-    <w:p>
-      <w:pPr>
-        <w:pStyle w:val="NormalWeb"/>
-        <w:rPr>
-          <w:rFonts w:ascii="Calibri" w:hAnsi="Calibri" w:cs="Calibri"/>
-          <w:sz w:val="22"/>
-          <w:szCs w:val="22"/>
-        </w:rPr>
-      </w:pPr>
-      <w:r>
-        <w:rPr>
-          <w:rFonts w:ascii="Calibri" w:hAnsi="Calibri" w:cs="Calibri"/>
-          <w:sz w:val="22"/>
-          <w:szCs w:val="22"/>
-        </w:rPr>
-        <w:t xml:space="preserve">6. </w:t>
-      </w:r>
-      <w:r>
-        <w:rPr>
-          <w:rStyle w:val="Strong"/>
-          <w:rFonts w:ascii="Calibri" w:hAnsi="Calibri" w:cs="Calibri"/>
-          <w:sz w:val="22"/>
-          <w:szCs w:val="22"/>
-        </w:rPr>
-        <w:t>Marketplaces/directories:</w:t>
-      </w:r>
-      <w:r>
-        <w:rPr>
-          <w:rFonts w:ascii="Calibri" w:hAnsi="Calibri" w:cs="Calibri"/>
-          <w:sz w:val="22"/>
-          <w:szCs w:val="22"/>
-        </w:rPr>
-        <w:t xml:space="preserve"> Product Hunt, AppSumo-style lifetime deal only if</w:t>
-      </w:r>
-    </w:p>
-    <w:p>
-      <w:pPr>
-        <w:pStyle w:val="NormalWeb"/>
-        <w:rPr>
-          <w:rFonts w:ascii="Calibri" w:hAnsi="Calibri" w:cs="Calibri"/>
-          <w:sz w:val="22"/>
-          <w:szCs w:val="22"/>
-        </w:rPr>
-      </w:pPr>
-      <w:r>
-        <w:rPr>
-          <w:rFonts w:ascii="Calibri" w:hAnsi="Calibri" w:cs="Calibri"/>
-          <w:sz w:val="22"/>
-          <w:szCs w:val="22"/>
-        </w:rPr>
-        <w:t>cash needed (note: LTD buyers churn/never upgrade — use sparingly), SaaS directories.</w:t>
-      </w:r>
-    </w:p>
-    <w:p>
-      <w:pPr>
-        <w:pStyle w:val="Heading2"/>
-        <w:rPr>
-          <w:rFonts w:ascii="Calibri" w:eastAsia="Times New Roman" w:hAnsi="Calibri" w:cs="Calibri"/>
-        </w:rPr>
-      </w:pPr>
-      <w:r>
-        <w:rPr>
-          <w:rFonts w:ascii="Calibri" w:eastAsia="Times New Roman" w:hAnsi="Calibri" w:cs="Calibri"/>
-        </w:rPr>
-        <w:t>5. 90-day</w:t>
-      </w:r>
-      <w:r>
-        <w:rPr>
-          <w:rFonts w:ascii="Calibri" w:eastAsia="Times New Roman" w:hAnsi="Calibri" w:cs="Calibri"/>
-        </w:rPr>
-        <w:t xml:space="preserve"> plan</w:t>
+        <w:t>5. 90-day plan</w:t>
       </w:r>
     </w:p>
     <w:p>
@@ -1404,7 +1419,15 @@
           <w:sz w:val="22"/>
           <w:szCs w:val="22"/>
         </w:rPr>
-        <w:t>[ ] Analytics events verified (signup, publish, product add, checkout).</w:t>
+        <w:t>[ ] Analytics events verified (signup, pub</w:t>
+      </w:r>
+      <w:r>
+        <w:rPr>
+          <w:rFonts w:ascii="Calibri" w:eastAsia="Times New Roman" w:hAnsi="Calibri" w:cs="Calibri"/>
+          <w:sz w:val="22"/>
+          <w:szCs w:val="22"/>
+        </w:rPr>
+        <w:t>lish, product add, checkout).</w:t>
       </w:r>
     </w:p>
     <w:p>
@@ -1426,15 +1449,7 @@
           <w:sz w:val="22"/>
           <w:szCs w:val="22"/>
         </w:rPr>
-        <w:t>[ ] Welcome email series live in own product; pas</w:t>
-      </w:r>
-      <w:r>
-        <w:rPr>
-          <w:rFonts w:ascii="Calibri" w:eastAsia="Times New Roman" w:hAnsi="Calibri" w:cs="Calibri"/>
-          <w:sz w:val="22"/>
-          <w:szCs w:val="22"/>
-        </w:rPr>
-        <w:t>sword-reset deliverability proven.</w:t>
+        <w:t>[ ] Welcome email series live in own product; password-reset deliverability proven.</w:t>
       </w:r>
     </w:p>
     <w:p>
@@ -1607,7 +1622,15 @@
           <w:sz w:val="22"/>
           <w:szCs w:val="22"/>
         </w:rPr>
-        <w:t>[ ] First 10 paying customers → testimonials + case snippets.</w:t>
+        <w:t xml:space="preserve">[ ] First 10 paying customers </w:t>
+      </w:r>
+      <w:r>
+        <w:rPr>
+          <w:rFonts w:ascii="Calibri" w:eastAsia="Times New Roman" w:hAnsi="Calibri" w:cs="Calibri"/>
+          <w:sz w:val="22"/>
+          <w:szCs w:val="22"/>
+        </w:rPr>
+        <w:t>→ testimonials + case snippets.</w:t>
       </w:r>
     </w:p>
     <w:p>
@@ -1714,7 +1737,15 @@
           <w:sz w:val="22"/>
           <w:szCs w:val="22"/>
         </w:rPr>
-        <w:t>[ ] Monthly changelog + template drops to fight churn.</w:t>
+        <w:t>[ ] Monthly changelog + template drops to fig</w:t>
+      </w:r>
+      <w:r>
+        <w:rPr>
+          <w:rFonts w:ascii="Calibri" w:eastAsia="Times New Roman" w:hAnsi="Calibri" w:cs="Calibri"/>
+          <w:sz w:val="22"/>
+          <w:szCs w:val="22"/>
+        </w:rPr>
+        <w:t>ht churn.</w:t>
       </w:r>
     </w:p>
     <w:p>
@@ -1746,15 +1777,7 @@
           <w:sz w:val="22"/>
           <w:szCs w:val="22"/>
         </w:rPr>
-        <w:t>1. Build-in-public</w:t>
-      </w:r>
-      <w:r>
-        <w:rPr>
-          <w:rFonts w:ascii="Calibri" w:hAnsi="Calibri" w:cs="Calibri"/>
-          <w:sz w:val="22"/>
-          <w:szCs w:val="22"/>
-        </w:rPr>
-        <w:t xml:space="preserve"> (features shipped, numbers shared).</w:t>
+        <w:t>1. Build-in-public (features shipped, numbers shared).</w:t>
       </w:r>
     </w:p>
     <w:p>
@@ -1808,33 +1831,33 @@
           <w:sz w:val="22"/>
           <w:szCs w:val="22"/>
         </w:rPr>
-        <w:t>4. Customer wins (screenshots, revenue shared with permission).</w:t>
-      </w:r>
-    </w:p>
-    <w:p>
-      <w:pPr>
-        <w:pStyle w:val="NormalWeb"/>
-        <w:rPr>
-          <w:rFonts w:ascii="Calibri" w:hAnsi="Calibri" w:cs="Calibri"/>
-          <w:sz w:val="22"/>
-          <w:szCs w:val="22"/>
-        </w:rPr>
-      </w:pPr>
-      <w:r>
-        <w:rPr>
-          <w:rFonts w:ascii="Calibri" w:hAnsi="Calibri" w:cs="Calibri"/>
-          <w:sz w:val="22"/>
-          <w:szCs w:val="22"/>
-        </w:rPr>
-        <w:t>Posting cadence: 1 short video/day, 2 posts/week long</w:t>
-      </w:r>
-      <w:r>
-        <w:rPr>
-          <w:rFonts w:ascii="Calibri" w:hAnsi="Calibri" w:cs="Calibri"/>
-          <w:sz w:val="22"/>
-          <w:szCs w:val="22"/>
-        </w:rPr>
-        <w:t>-form, 1 email/week to list.</w:t>
+        <w:t>4. Customer wins (screenshots, revenue shared with per</w:t>
+      </w:r>
+      <w:r>
+        <w:rPr>
+          <w:rFonts w:ascii="Calibri" w:hAnsi="Calibri" w:cs="Calibri"/>
+          <w:sz w:val="22"/>
+          <w:szCs w:val="22"/>
+        </w:rPr>
+        <w:t>mission).</w:t>
+      </w:r>
+    </w:p>
+    <w:p>
+      <w:pPr>
+        <w:pStyle w:val="NormalWeb"/>
+        <w:rPr>
+          <w:rFonts w:ascii="Calibri" w:hAnsi="Calibri" w:cs="Calibri"/>
+          <w:sz w:val="22"/>
+          <w:szCs w:val="22"/>
+        </w:rPr>
+      </w:pPr>
+      <w:r>
+        <w:rPr>
+          <w:rFonts w:ascii="Calibri" w:hAnsi="Calibri" w:cs="Calibri"/>
+          <w:sz w:val="22"/>
+          <w:szCs w:val="22"/>
+        </w:rPr>
+        <w:t>Posting cadence: 1 short video/day, 2 posts/week long-form, 1 email/week to list.</w:t>
       </w:r>
     </w:p>
     <w:p>
@@ -2045,23 +2068,24 @@
           <w:sz w:val="22"/>
           <w:szCs w:val="22"/>
         </w:rPr>
-        <w:t>$0/mo (organic only):</w:t>
-      </w:r>
-      <w:r>
-        <w:rPr>
-          <w:rFonts w:ascii="Calibri" w:eastAsia="Times New Roman" w:hAnsi="Calibri" w:cs="Calibri"/>
-          <w:sz w:val="22"/>
-          <w:szCs w:val="22"/>
-        </w:rPr>
-        <w:t xml:space="preserve"> </w:t>
-      </w:r>
-      <w:r>
-        <w:rPr>
-          <w:rFonts w:ascii="Calibri" w:eastAsia="Times New Roman" w:hAnsi="Calibri" w:cs="Calibri"/>
-          <w:sz w:val="22"/>
-          <w:szCs w:val="22"/>
-        </w:rPr>
-        <w:t>time = 1–2 hrs/day content + SEO. Slow, sustainable.</w:t>
+        <w:t>$0/m</w:t>
+      </w:r>
+      <w:r>
+        <w:rPr>
+          <w:rStyle w:val="Strong"/>
+          <w:rFonts w:ascii="Calibri" w:eastAsia="Times New Roman" w:hAnsi="Calibri" w:cs="Calibri"/>
+          <w:sz w:val="22"/>
+          <w:szCs w:val="22"/>
+        </w:rPr>
+        <w:t>o (organic only):</w:t>
+      </w:r>
+      <w:r>
+        <w:rPr>
+          <w:rFonts w:ascii="Calibri" w:eastAsia="Times New Roman" w:hAnsi="Calibri" w:cs="Calibri"/>
+          <w:sz w:val="22"/>
+          <w:szCs w:val="22"/>
+        </w:rPr>
+        <w:t xml:space="preserve"> time = 1–2 hrs/day content + SEO. Slow, sustainable.</w:t>
       </w:r>
     </w:p>
     <w:p>
@@ -2177,15 +2201,7 @@
           <w:sz w:val="22"/>
           <w:szCs w:val="22"/>
         </w:rPr>
-        <w:t>Subscription bi</w:t>
-      </w:r>
-      <w:r>
-        <w:rPr>
-          <w:rFonts w:ascii="Calibri" w:eastAsia="Times New Roman" w:hAnsi="Calibri" w:cs="Calibri"/>
-          <w:sz w:val="22"/>
-          <w:szCs w:val="22"/>
-        </w:rPr>
-        <w:t>lling blocked (KYC) → sell one-time products/courses first;</w:t>
+        <w:t>Subscription billing blocked (KYC) → sell one-time products/courses first;</w:t>
       </w:r>
     </w:p>
     <w:p>
@@ -2247,15 +2263,15 @@
           <w:sz w:val="22"/>
           <w:szCs w:val="22"/>
         </w:rPr>
-        <w:t xml:space="preserve">Deliverability (new domain) → warm up email, SPF/DKIM/DMARC via </w:t>
-      </w:r>
-      <w:r>
-        <w:rPr>
-          <w:rFonts w:ascii="Calibri" w:eastAsia="Times New Roman" w:hAnsi="Calibri" w:cs="Calibri"/>
-          <w:sz w:val="22"/>
-          <w:szCs w:val="22"/>
-        </w:rPr>
-        <w:t>Brevo, monitor bounces.</w:t>
+        <w:t>Deliverability (new doma</w:t>
+      </w:r>
+      <w:r>
+        <w:rPr>
+          <w:rFonts w:ascii="Calibri" w:eastAsia="Times New Roman" w:hAnsi="Calibri" w:cs="Calibri"/>
+          <w:sz w:val="22"/>
+          <w:szCs w:val="22"/>
+        </w:rPr>
+        <w:t>in) → warm up email, SPF/DKIM/DMARC via Brevo, monitor bounces.</w:t>
       </w:r>
     </w:p>
     <w:p>
@@ -2327,33 +2343,33 @@
           <w:sz w:val="22"/>
           <w:szCs w:val="22"/>
         </w:rPr>
-        <w:t>2. Launch date and first channel (video vs SEO vs affiliates)?</w:t>
-      </w:r>
-    </w:p>
-    <w:p>
-      <w:pPr>
-        <w:pStyle w:val="NormalWeb"/>
-        <w:rPr>
-          <w:rFonts w:ascii="Calibri" w:hAnsi="Calibri" w:cs="Calibri"/>
-          <w:sz w:val="22"/>
-          <w:szCs w:val="22"/>
-        </w:rPr>
-      </w:pPr>
-      <w:r>
-        <w:rPr>
-          <w:rFonts w:ascii="Calibri" w:hAnsi="Calibri" w:cs="Calibri"/>
-          <w:sz w:val="22"/>
-          <w:szCs w:val="22"/>
-        </w:rPr>
-        <w:t>3. Affiliate comm</w:t>
-      </w:r>
-      <w:r>
-        <w:rPr>
-          <w:rFonts w:ascii="Calibri" w:hAnsi="Calibri" w:cs="Calibri"/>
-          <w:sz w:val="22"/>
-          <w:szCs w:val="22"/>
-        </w:rPr>
-        <w:t>ission (suggest 30% recurring, 12 months)?</w:t>
+        <w:t xml:space="preserve">2. Launch date and first channel (video </w:t>
+      </w:r>
+      <w:r>
+        <w:rPr>
+          <w:rFonts w:ascii="Calibri" w:hAnsi="Calibri" w:cs="Calibri"/>
+          <w:sz w:val="22"/>
+          <w:szCs w:val="22"/>
+        </w:rPr>
+        <w:t>vs SEO vs affiliates)?</w:t>
+      </w:r>
+    </w:p>
+    <w:p>
+      <w:pPr>
+        <w:pStyle w:val="NormalWeb"/>
+        <w:rPr>
+          <w:rFonts w:ascii="Calibri" w:hAnsi="Calibri" w:cs="Calibri"/>
+          <w:sz w:val="22"/>
+          <w:szCs w:val="22"/>
+        </w:rPr>
+      </w:pPr>
+      <w:r>
+        <w:rPr>
+          <w:rFonts w:ascii="Calibri" w:hAnsi="Calibri" w:cs="Calibri"/>
+          <w:sz w:val="22"/>
+          <w:szCs w:val="22"/>
+        </w:rPr>
+        <w:t>3. Affiliate commission (suggest 30% recurring, 12 months)?</w:t>
       </w:r>
     </w:p>
     <w:p>
@@ -2387,9 +2403,9 @@
 <file path=word/numbering.xml><?xml version="1.0" encoding="utf-8"?>
 <w:numbering xmlns:wpc="http://schemas.microsoft.com/office/word/2010/wordprocessingCanvas" xmlns:mc="http://schemas.openxmlformats.org/markup-compatibility/2006" xmlns:o="urn:schemas-microsoft-com:office:office" xmlns:r="http://schemas.openxmlformats.org/officeDocument/2006/relationships" xmlns:m="http://schemas.openxmlformats.org/officeDocument/2006/math" xmlns:v="urn:schemas-microsoft-com:vml" xmlns:wp14="http://schemas.microsoft.com/office/word/2010/wordprocessingDrawing" xmlns:wp="http://schemas.openxmlformats.org/drawingml/2006/wordprocessingDrawing" xmlns:w10="urn:schemas-microsoft-com:office:word" xmlns:w="http://schemas.openxmlformats.org/wordprocessingml/2006/main" xmlns:w14="http://schemas.microsoft.com/office/word/2010/wordml" xmlns:wpg="http://schemas.microsoft.com/office/word/2010/wordprocessingGroup" xmlns:wpi="http://schemas.microsoft.com/office/word/2010/wordprocessingInk" xmlns:wne="http://schemas.microsoft.com/office/word/2006/wordml" xmlns:wps="http://schemas.microsoft.com/office/word/2010/wordprocessingShape" mc:Ignorable="w14 wp14">
   <w:abstractNum w:abstractNumId="0">
-    <w:nsid w:val="0951207C"/>
+    <w:nsid w:val="00351E17"/>
     <w:multiLevelType w:val="multilevel"/>
-    <w:tmpl w:val="F06A9A76"/>
+    <w:tmpl w:val="25FCA308"/>
     <w:lvl w:ilvl="0">
       <w:start w:val="1"/>
       <w:numFmt w:val="bullet"/>
@@ -2536,9 +2552,9 @@
     </w:lvl>
   </w:abstractNum>
   <w:abstractNum w:abstractNumId="1">
-    <w:nsid w:val="15F0512C"/>
+    <w:nsid w:val="0E6E5522"/>
     <w:multiLevelType w:val="multilevel"/>
-    <w:tmpl w:val="89E80468"/>
+    <w:tmpl w:val="797AA176"/>
     <w:lvl w:ilvl="0">
       <w:start w:val="1"/>
       <w:numFmt w:val="bullet"/>
@@ -2685,9 +2701,9 @@
     </w:lvl>
   </w:abstractNum>
   <w:abstractNum w:abstractNumId="2">
-    <w:nsid w:val="1CC1493F"/>
+    <w:nsid w:val="11CF5B1D"/>
     <w:multiLevelType w:val="multilevel"/>
-    <w:tmpl w:val="64C4272E"/>
+    <w:tmpl w:val="4AFC1DA0"/>
     <w:lvl w:ilvl="0">
       <w:start w:val="1"/>
       <w:numFmt w:val="bullet"/>
@@ -2834,9 +2850,9 @@
     </w:lvl>
   </w:abstractNum>
   <w:abstractNum w:abstractNumId="3">
-    <w:nsid w:val="352B606F"/>
+    <w:nsid w:val="2BB735FF"/>
     <w:multiLevelType w:val="multilevel"/>
-    <w:tmpl w:val="A12CA69E"/>
+    <w:tmpl w:val="8BA2501C"/>
     <w:lvl w:ilvl="0">
       <w:start w:val="1"/>
       <w:numFmt w:val="bullet"/>
@@ -2983,9 +2999,9 @@
     </w:lvl>
   </w:abstractNum>
   <w:abstractNum w:abstractNumId="4">
-    <w:nsid w:val="35B7758B"/>
+    <w:nsid w:val="459811BB"/>
     <w:multiLevelType w:val="multilevel"/>
-    <w:tmpl w:val="342256F4"/>
+    <w:tmpl w:val="DC648628"/>
     <w:lvl w:ilvl="0">
       <w:start w:val="1"/>
       <w:numFmt w:val="bullet"/>
@@ -3132,9 +3148,9 @@
     </w:lvl>
   </w:abstractNum>
   <w:abstractNum w:abstractNumId="5">
-    <w:nsid w:val="3AD71163"/>
+    <w:nsid w:val="5A330D20"/>
     <w:multiLevelType w:val="multilevel"/>
-    <w:tmpl w:val="681C50FA"/>
+    <w:tmpl w:val="5436F24A"/>
     <w:lvl w:ilvl="0">
       <w:start w:val="1"/>
       <w:numFmt w:val="bullet"/>
@@ -3281,9 +3297,9 @@
     </w:lvl>
   </w:abstractNum>
   <w:abstractNum w:abstractNumId="6">
-    <w:nsid w:val="78CB54F2"/>
+    <w:nsid w:val="5A832B0A"/>
     <w:multiLevelType w:val="multilevel"/>
-    <w:tmpl w:val="0876D620"/>
+    <w:tmpl w:val="BAC6CD8C"/>
     <w:lvl w:ilvl="0">
       <w:start w:val="1"/>
       <w:numFmt w:val="bullet"/>
@@ -3430,25 +3446,25 @@
     </w:lvl>
   </w:abstractNum>
   <w:num w:numId="1">
-    <w:abstractNumId w:val="1"/>
+    <w:abstractNumId w:val="3"/>
   </w:num>
   <w:num w:numId="2">
-    <w:abstractNumId w:val="3"/>
+    <w:abstractNumId w:val="6"/>
   </w:num>
   <w:num w:numId="3">
-    <w:abstractNumId w:val="4"/>
+    <w:abstractNumId w:val="0"/>
   </w:num>
   <w:num w:numId="4">
-    <w:abstractNumId w:val="2"/>
+    <w:abstractNumId w:val="1"/>
   </w:num>
   <w:num w:numId="5">
     <w:abstractNumId w:val="5"/>
   </w:num>
   <w:num w:numId="6">
-    <w:abstractNumId w:val="6"/>
+    <w:abstractNumId w:val="4"/>
   </w:num>
   <w:num w:numId="7">
-    <w:abstractNumId w:val="0"/>
+    <w:abstractNumId w:val="2"/>
   </w:num>
 </w:numbering>
 </file>

</xml_diff>